<commit_message>
Organizar versiones y completar materiales iniciales de C y Microprocesadores
</commit_message>
<xml_diff>
--- a/Laboratorio Lenguaje C Embebido/Semana 1/01_Clase_Tipos_de_Datos_y_Variables.docx
+++ b/Laboratorio Lenguaje C Embebido/Semana 1/01_Clase_Tipos_de_Datos_y_Variables.docx
@@ -1660,7 +1660,7 @@
         <w:pStyle w:val="ListBullet"/>
       </w:pPr>
       <w:r>
-        <w:t>Alimentación VCC y GND del microcontrolador; configure Clock Frequency con el valor del cristal instalado: 8 MHz o 16 MHz.</w:t>
+        <w:t>Alimentación VCC y GND del microcontrolador; configure Clock Frequency = 1 MHz para esta primera práctica.</w:t>
       </w:r>
     </w:p>
     <w:p>
@@ -1696,11 +1696,7 @@
                 <w:rFonts w:ascii="Consolas" w:hAnsi="Consolas"/>
                 <w:sz w:val="17"/>
               </w:rPr>
-              <w:t>// Seleccione UNA opcion segun el cristal instalado</w:t>
-              <w:br/>
-              <w:t>#define F_CPU 8000000UL      // Cristal de 8 MHz</w:t>
-              <w:br/>
-              <w:t>// #define F_CPU 16000000UL  // Cristal de 16 MHz</w:t>
+              <w:t>#define F_CPU 1000000UL</w:t>
               <w:br/>
               <w:t>#include &lt;avr/io.h&gt;</w:t>
               <w:br/>
@@ -1765,7 +1761,7 @@
         <w:pStyle w:val="ListBullet"/>
       </w:pPr>
       <w:r>
-        <w:t>Abra las propiedades del ATMEGA328P, cargue el Program File (.hex) y fije Clock Frequency en 8 MHz o 16 MHz, según el cristal instalado. El ATmega328P debe tener los fusibles configurados para reloj externo; verifíquelo con el docente.</w:t>
+        <w:t>Abra las propiedades del ATMEGA328P, cargue el Program File (.hex) y fije Clock Frequency en 1 MHz.</w:t>
       </w:r>
     </w:p>
     <w:p>
@@ -2543,6 +2539,1237 @@
         <w:br w:type="page"/>
       </w:r>
     </w:p>
+    <w:p>
+      <w:pPr>
+        <w:pStyle w:val="Heading1"/>
+      </w:pPr>
+      <w:r>
+        <w:t>Tarea práctica para la próxima clase: montaje físico de PORTD</w:t>
+      </w:r>
+    </w:p>
+    <w:p>
+      <w:r>
+        <w:rPr>
+          <w:b/>
+        </w:rPr>
+        <w:t xml:space="preserve">Propósito. </w:t>
+      </w:r>
+      <w:r>
+        <w:t>Trasladar la simulación de la clase 01 a un circuito real con ATmega328P en protoboard. El estudiante debe llevar el material preparado, explicar el valor almacenado en una variable uint8_t y comprobarlo mediante LEDs.</w:t>
+      </w:r>
+    </w:p>
+    <w:p>
+      <w:pPr>
+        <w:pStyle w:val="Heading2"/>
+      </w:pPr>
+      <w:r>
+        <w:t>Entrega y modalidad</w:t>
+      </w:r>
+    </w:p>
+    <w:tbl>
+      <w:tblPr>
+        <w:tblStyle w:val="TableGrid"/>
+        <w:tblW w:type="auto" w:w="0"/>
+        <w:jc w:val="center"/>
+        <w:tblLayout w:type="fixed"/>
+        <w:tblLook w:firstColumn="1" w:firstRow="1" w:lastColumn="0" w:lastRow="0" w:noHBand="0" w:noVBand="1" w:val="04A0"/>
+      </w:tblPr>
+      <w:tblGrid>
+        <w:gridCol w:w="4896"/>
+        <w:gridCol w:w="4896"/>
+      </w:tblGrid>
+      <w:tr>
+        <w:tc>
+          <w:tcPr>
+            <w:tcW w:type="dxa" w:w="1800"/>
+            <w:vAlign w:val="center"/>
+            <w:shd w:fill="2E74B5"/>
+          </w:tcPr>
+          <w:p>
+            <w:pPr>
+              <w:spacing w:after="0"/>
+            </w:pPr>
+            <w:r>
+              <w:rPr>
+                <w:rFonts w:ascii="Calibri" w:hAnsi="Calibri"/>
+                <w:b/>
+                <w:color w:val="FFFFFF"/>
+                <w:sz w:val="19"/>
+              </w:rPr>
+              <w:t>Aspecto</w:t>
+            </w:r>
+          </w:p>
+        </w:tc>
+        <w:tc>
+          <w:tcPr>
+            <w:tcW w:type="dxa" w:w="7560"/>
+            <w:vAlign w:val="center"/>
+            <w:shd w:fill="2E74B5"/>
+          </w:tcPr>
+          <w:p>
+            <w:pPr>
+              <w:spacing w:after="0"/>
+            </w:pPr>
+            <w:r>
+              <w:rPr>
+                <w:rFonts w:ascii="Calibri" w:hAnsi="Calibri"/>
+                <w:b/>
+                <w:color w:val="FFFFFF"/>
+                <w:sz w:val="19"/>
+              </w:rPr>
+              <w:t>Indicación</w:t>
+            </w:r>
+          </w:p>
+        </w:tc>
+      </w:tr>
+      <w:tr>
+        <w:tc>
+          <w:tcPr>
+            <w:tcW w:type="dxa" w:w="1800"/>
+            <w:vAlign w:val="center"/>
+            <w:shd w:fill="F2F4F7"/>
+          </w:tcPr>
+          <w:p>
+            <w:pPr>
+              <w:spacing w:after="0"/>
+            </w:pPr>
+            <w:r>
+              <w:rPr>
+                <w:rFonts w:ascii="Calibri" w:hAnsi="Calibri"/>
+                <w:sz w:val="19"/>
+              </w:rPr>
+              <w:t>Modalidad</w:t>
+            </w:r>
+          </w:p>
+        </w:tc>
+        <w:tc>
+          <w:tcPr>
+            <w:tcW w:type="dxa" w:w="7560"/>
+            <w:vAlign w:val="center"/>
+            <w:shd w:fill="F2F4F7"/>
+          </w:tcPr>
+          <w:p>
+            <w:pPr>
+              <w:spacing w:after="0"/>
+            </w:pPr>
+            <w:r>
+              <w:rPr>
+                <w:rFonts w:ascii="Calibri" w:hAnsi="Calibri"/>
+                <w:sz w:val="19"/>
+              </w:rPr>
+              <w:t>Individual o parejas, según indique el docente.</w:t>
+            </w:r>
+          </w:p>
+        </w:tc>
+      </w:tr>
+      <w:tr>
+        <w:tc>
+          <w:tcPr>
+            <w:tcW w:type="dxa" w:w="1800"/>
+            <w:vAlign w:val="center"/>
+          </w:tcPr>
+          <w:p>
+            <w:pPr>
+              <w:spacing w:after="0"/>
+            </w:pPr>
+            <w:r>
+              <w:rPr>
+                <w:rFonts w:ascii="Calibri" w:hAnsi="Calibri"/>
+                <w:sz w:val="19"/>
+              </w:rPr>
+              <w:t>Fecha</w:t>
+            </w:r>
+          </w:p>
+        </w:tc>
+        <w:tc>
+          <w:tcPr>
+            <w:tcW w:type="dxa" w:w="7560"/>
+            <w:vAlign w:val="center"/>
+          </w:tcPr>
+          <w:p>
+            <w:pPr>
+              <w:spacing w:after="0"/>
+            </w:pPr>
+            <w:r>
+              <w:rPr>
+                <w:rFonts w:ascii="Calibri" w:hAnsi="Calibri"/>
+                <w:sz w:val="19"/>
+              </w:rPr>
+              <w:t>Traer el montaje y los materiales a la siguiente sesión.</w:t>
+            </w:r>
+          </w:p>
+        </w:tc>
+      </w:tr>
+      <w:tr>
+        <w:tc>
+          <w:tcPr>
+            <w:tcW w:type="dxa" w:w="1800"/>
+            <w:vAlign w:val="center"/>
+            <w:shd w:fill="F2F4F7"/>
+          </w:tcPr>
+          <w:p>
+            <w:pPr>
+              <w:spacing w:after="0"/>
+            </w:pPr>
+            <w:r>
+              <w:rPr>
+                <w:rFonts w:ascii="Calibri" w:hAnsi="Calibri"/>
+                <w:sz w:val="19"/>
+              </w:rPr>
+              <w:t>En clase</w:t>
+            </w:r>
+          </w:p>
+        </w:tc>
+        <w:tc>
+          <w:tcPr>
+            <w:tcW w:type="dxa" w:w="7560"/>
+            <w:vAlign w:val="center"/>
+            <w:shd w:fill="F2F4F7"/>
+          </w:tcPr>
+          <w:p>
+            <w:pPr>
+              <w:spacing w:after="0"/>
+            </w:pPr>
+            <w:r>
+              <w:rPr>
+                <w:rFonts w:ascii="Calibri" w:hAnsi="Calibri"/>
+                <w:sz w:val="19"/>
+              </w:rPr>
+              <w:t>El circuito será revisado antes de alimentarlo y programarlo.</w:t>
+            </w:r>
+          </w:p>
+        </w:tc>
+      </w:tr>
+      <w:tr>
+        <w:tc>
+          <w:tcPr>
+            <w:tcW w:type="dxa" w:w="1800"/>
+            <w:vAlign w:val="center"/>
+          </w:tcPr>
+          <w:p>
+            <w:pPr>
+              <w:spacing w:after="0"/>
+            </w:pPr>
+            <w:r>
+              <w:rPr>
+                <w:rFonts w:ascii="Calibri" w:hAnsi="Calibri"/>
+                <w:sz w:val="19"/>
+              </w:rPr>
+              <w:t>Evidencia</w:t>
+            </w:r>
+          </w:p>
+        </w:tc>
+        <w:tc>
+          <w:tcPr>
+            <w:tcW w:type="dxa" w:w="7560"/>
+            <w:vAlign w:val="center"/>
+          </w:tcPr>
+          <w:p>
+            <w:pPr>
+              <w:spacing w:after="0"/>
+            </w:pPr>
+            <w:r>
+              <w:rPr>
+                <w:rFonts w:ascii="Calibri" w:hAnsi="Calibri"/>
+                <w:sz w:val="19"/>
+              </w:rPr>
+              <w:t>Montaje funcional, código fuente y tabla de pruebas completada.</w:t>
+            </w:r>
+          </w:p>
+        </w:tc>
+      </w:tr>
+    </w:tbl>
+    <w:p>
+      <w:pPr>
+        <w:pStyle w:val="Heading2"/>
+      </w:pPr>
+      <w:r>
+        <w:t>Materiales que debe traer</w:t>
+      </w:r>
+    </w:p>
+    <w:p>
+      <w:pPr>
+        <w:pStyle w:val="ListBullet"/>
+      </w:pPr>
+      <w:r>
+        <w:t>1 ATmega328P en encapsulado DIP-28 (no versión SMD).</w:t>
+      </w:r>
+    </w:p>
+    <w:p>
+      <w:pPr>
+        <w:pStyle w:val="ListBullet"/>
+      </w:pPr>
+      <w:r>
+        <w:t>1 protoboard y cables de conexión.</w:t>
+      </w:r>
+    </w:p>
+    <w:p>
+      <w:pPr>
+        <w:pStyle w:val="ListBullet"/>
+      </w:pPr>
+      <w:r>
+        <w:t>8 LEDs (colores a elección) y 8 resistencias de 220 ohm a 330 ohm, una por cada LED.</w:t>
+      </w:r>
+    </w:p>
+    <w:p>
+      <w:pPr>
+        <w:pStyle w:val="ListBullet"/>
+      </w:pPr>
+      <w:r>
+        <w:t>1 resistencia de 10 kiloohm para RESET y 1 capacitor cerámico de 100 nF para desacoplo.</w:t>
+      </w:r>
+    </w:p>
+    <w:p>
+      <w:pPr>
+        <w:pStyle w:val="ListBullet"/>
+      </w:pPr>
+      <w:r>
+        <w:t>Fuente regulada de 5 V o módulo de alimentación para protoboard. Nunca conecte una batería o fuente mayor de 5 V directamente al ATmega328P.</w:t>
+      </w:r>
+    </w:p>
+    <w:p>
+      <w:pPr>
+        <w:pStyle w:val="ListBullet"/>
+      </w:pPr>
+      <w:r>
+        <w:t>Programador disponible en el laboratorio (USBasp, Atmel-ICE o Arduino como ISP, según indique el docente) y cables ISP. Si tiene programador propio, puede traerlo.</w:t>
+      </w:r>
+    </w:p>
+    <w:p>
+      <w:pPr>
+        <w:pStyle w:val="ListBullet"/>
+      </w:pPr>
+      <w:r>
+        <w:t>Opcional si el docente usa reloj externo: cristal de 16 MHz y 2 capacitores de 22 pF. No los monte si no ha sido indicado; el código y los fusibles deben coincidir con el reloj elegido.</w:t>
+      </w:r>
+    </w:p>
+    <w:p>
+      <w:pPr>
+        <w:pStyle w:val="Heading2"/>
+      </w:pPr>
+      <w:r>
+        <w:t>Armado previo: sin alimentar hasta la revisión</w:t>
+      </w:r>
+    </w:p>
+    <w:p>
+      <w:pPr>
+        <w:pStyle w:val="ListBullet"/>
+      </w:pPr>
+      <w:r>
+        <w:t>Coloque el ATmega328P atravesando la ranura central de la protoboard, con la muesca orientada para identificar el pin 1.</w:t>
+      </w:r>
+    </w:p>
+    <w:p>
+      <w:pPr>
+        <w:pStyle w:val="ListBullet"/>
+      </w:pPr>
+      <w:r>
+        <w:t>Conecte VCC (pin 7) y AVCC (pin 20) a +5 V. Conecte GND (pines 8 y 22) a tierra. Todas las tierras deben ser comunes.</w:t>
+      </w:r>
+    </w:p>
+    <w:p>
+      <w:pPr>
+        <w:pStyle w:val="ListBullet"/>
+      </w:pPr>
+      <w:r>
+        <w:t>Coloque el capacitor de 100 nF entre +5 V y GND, cerca del microcontrolador.</w:t>
+      </w:r>
+    </w:p>
+    <w:p>
+      <w:pPr>
+        <w:pStyle w:val="ListBullet"/>
+      </w:pPr>
+      <w:r>
+        <w:t>Conecte RESET (pin 1) a +5 V mediante la resistencia de 10 kiloohm.</w:t>
+      </w:r>
+    </w:p>
+    <w:p>
+      <w:pPr>
+        <w:pStyle w:val="ListBullet"/>
+      </w:pPr>
+      <w:r>
+        <w:t>Prepare ocho ramas independientes: PD0 a PD7 (pines físicos 2 al 6 y 11 al 13) -&gt; resistencia -&gt; ánodo del LED; cátodo de cada LED -&gt; GND. Respete la polaridad: la pata larga suele ser el ánodo.</w:t>
+      </w:r>
+    </w:p>
+    <w:p>
+      <w:pPr>
+        <w:pStyle w:val="ListBullet"/>
+      </w:pPr>
+      <w:r>
+        <w:t>No conecte simultáneamente la fuente del protoboard y la alimentación del programador sin confirmar con el docente cuál alimentará el circuito.</w:t>
+      </w:r>
+    </w:p>
+    <w:p>
+      <w:pPr>
+        <w:pStyle w:val="Heading2"/>
+      </w:pPr>
+      <w:r>
+        <w:t>Código que debe llevar compilado</w:t>
+      </w:r>
+    </w:p>
+    <w:p>
+      <w:r>
+        <w:t>Cree y compile en Microchip Studio un proyecto para ATmega328P. Lleve el archivo main.c y su .hex. El valor de PATRON se cambiará durante la práctica.</w:t>
+      </w:r>
+    </w:p>
+    <w:tbl>
+      <w:tblPr>
+        <w:tblStyle w:val="TableGrid"/>
+        <w:tblW w:type="auto" w:w="0"/>
+        <w:tblLook w:firstColumn="1" w:firstRow="1" w:lastColumn="0" w:lastRow="0" w:noHBand="0" w:noVBand="1" w:val="04A0"/>
+      </w:tblPr>
+      <w:tblGrid>
+        <w:gridCol w:w="9792"/>
+      </w:tblGrid>
+      <w:tr>
+        <w:tc>
+          <w:tcPr>
+            <w:tcW w:type="dxa" w:w="9792"/>
+            <w:shd w:fill="F4F6F9"/>
+          </w:tcPr>
+          <w:p>
+            <w:pPr>
+              <w:spacing w:before="100" w:after="100"/>
+            </w:pPr>
+            <w:r>
+              <w:rPr>
+                <w:rFonts w:ascii="Consolas" w:hAnsi="Consolas"/>
+                <w:sz w:val="17"/>
+              </w:rPr>
+              <w:t>#define F_CPU 1000000UL</w:t>
+              <w:br/>
+              <w:t>#include &lt;avr/io.h&gt;</w:t>
+              <w:br/>
+              <w:t>#include &lt;stdint.h&gt;</w:t>
+              <w:br/>
+              <w:br/>
+              <w:t>#define PATRON 5</w:t>
+              <w:br/>
+              <w:br/>
+              <w:t>int main(void)</w:t>
+              <w:br/>
+              <w:t>{</w:t>
+              <w:br/>
+              <w:t xml:space="preserve">    uint8_t patron_led = PATRON;</w:t>
+              <w:br/>
+              <w:br/>
+              <w:t xml:space="preserve">    DDRD = 0xFF;</w:t>
+              <w:br/>
+              <w:br/>
+              <w:t xml:space="preserve">    while (1)</w:t>
+              <w:br/>
+              <w:t xml:space="preserve">    {</w:t>
+              <w:br/>
+              <w:t xml:space="preserve">        PORTD = patron_led;</w:t>
+              <w:br/>
+              <w:t xml:space="preserve">    }</w:t>
+              <w:br/>
+              <w:t>}</w:t>
+            </w:r>
+          </w:p>
+        </w:tc>
+      </w:tr>
+    </w:tbl>
+    <w:p>
+      <w:r>
+        <w:t>Nota: si el microcontrolador fue configurado para otro reloj, actualice F_CPU según la indicación del docente. Para esta actividad no cambie fusibles por cuenta propia.</w:t>
+      </w:r>
+    </w:p>
+    <w:p>
+      <w:pPr>
+        <w:pStyle w:val="Heading2"/>
+      </w:pPr>
+      <w:r>
+        <w:t>Pruebas mínimas</w:t>
+      </w:r>
+    </w:p>
+    <w:tbl>
+      <w:tblPr>
+        <w:tblStyle w:val="TableGrid"/>
+        <w:tblW w:type="auto" w:w="0"/>
+        <w:jc w:val="center"/>
+        <w:tblLayout w:type="fixed"/>
+        <w:tblLook w:firstColumn="1" w:firstRow="1" w:lastColumn="0" w:lastRow="0" w:noHBand="0" w:noVBand="1" w:val="04A0"/>
+      </w:tblPr>
+      <w:tblGrid>
+        <w:gridCol w:w="2448"/>
+        <w:gridCol w:w="2448"/>
+        <w:gridCol w:w="2448"/>
+        <w:gridCol w:w="2448"/>
+      </w:tblGrid>
+      <w:tr>
+        <w:tc>
+          <w:tcPr>
+            <w:tcW w:type="dxa" w:w="1224"/>
+            <w:vAlign w:val="center"/>
+            <w:shd w:fill="2E74B5"/>
+          </w:tcPr>
+          <w:p>
+            <w:pPr>
+              <w:spacing w:after="0"/>
+            </w:pPr>
+            <w:r>
+              <w:rPr>
+                <w:rFonts w:ascii="Calibri" w:hAnsi="Calibri"/>
+                <w:b/>
+                <w:color w:val="FFFFFF"/>
+                <w:sz w:val="19"/>
+              </w:rPr>
+              <w:t>PATRON</w:t>
+            </w:r>
+          </w:p>
+        </w:tc>
+        <w:tc>
+          <w:tcPr>
+            <w:tcW w:type="dxa" w:w="2304"/>
+            <w:vAlign w:val="center"/>
+            <w:shd w:fill="2E74B5"/>
+          </w:tcPr>
+          <w:p>
+            <w:pPr>
+              <w:spacing w:after="0"/>
+            </w:pPr>
+            <w:r>
+              <w:rPr>
+                <w:rFonts w:ascii="Calibri" w:hAnsi="Calibri"/>
+                <w:b/>
+                <w:color w:val="FFFFFF"/>
+                <w:sz w:val="19"/>
+              </w:rPr>
+              <w:t>Binario esperado</w:t>
+            </w:r>
+          </w:p>
+        </w:tc>
+        <w:tc>
+          <w:tcPr>
+            <w:tcW w:type="dxa" w:w="4248"/>
+            <w:vAlign w:val="center"/>
+            <w:shd w:fill="2E74B5"/>
+          </w:tcPr>
+          <w:p>
+            <w:pPr>
+              <w:spacing w:after="0"/>
+            </w:pPr>
+            <w:r>
+              <w:rPr>
+                <w:rFonts w:ascii="Calibri" w:hAnsi="Calibri"/>
+                <w:b/>
+                <w:color w:val="FFFFFF"/>
+                <w:sz w:val="19"/>
+              </w:rPr>
+              <w:t>LEDs encendidos</w:t>
+            </w:r>
+          </w:p>
+        </w:tc>
+        <w:tc>
+          <w:tcPr>
+            <w:tcW w:type="dxa" w:w="1584"/>
+            <w:vAlign w:val="center"/>
+            <w:shd w:fill="2E74B5"/>
+          </w:tcPr>
+          <w:p>
+            <w:pPr>
+              <w:spacing w:after="0"/>
+            </w:pPr>
+            <w:r>
+              <w:rPr>
+                <w:rFonts w:ascii="Calibri" w:hAnsi="Calibri"/>
+                <w:b/>
+                <w:color w:val="FFFFFF"/>
+                <w:sz w:val="19"/>
+              </w:rPr>
+              <w:t>Verificado</w:t>
+            </w:r>
+          </w:p>
+        </w:tc>
+      </w:tr>
+      <w:tr>
+        <w:tc>
+          <w:tcPr>
+            <w:tcW w:type="dxa" w:w="1224"/>
+            <w:vAlign w:val="center"/>
+            <w:shd w:fill="F2F4F7"/>
+          </w:tcPr>
+          <w:p>
+            <w:pPr>
+              <w:spacing w:after="0"/>
+            </w:pPr>
+            <w:r>
+              <w:rPr>
+                <w:rFonts w:ascii="Calibri" w:hAnsi="Calibri"/>
+                <w:sz w:val="19"/>
+              </w:rPr>
+              <w:t>1</w:t>
+            </w:r>
+          </w:p>
+        </w:tc>
+        <w:tc>
+          <w:tcPr>
+            <w:tcW w:type="dxa" w:w="2304"/>
+            <w:vAlign w:val="center"/>
+            <w:shd w:fill="F2F4F7"/>
+          </w:tcPr>
+          <w:p>
+            <w:pPr>
+              <w:spacing w:after="0"/>
+            </w:pPr>
+            <w:r>
+              <w:rPr>
+                <w:rFonts w:ascii="Calibri" w:hAnsi="Calibri"/>
+                <w:sz w:val="19"/>
+              </w:rPr>
+              <w:t>00000001</w:t>
+            </w:r>
+          </w:p>
+        </w:tc>
+        <w:tc>
+          <w:tcPr>
+            <w:tcW w:type="dxa" w:w="4248"/>
+            <w:vAlign w:val="center"/>
+            <w:shd w:fill="F2F4F7"/>
+          </w:tcPr>
+          <w:p>
+            <w:pPr>
+              <w:spacing w:after="0"/>
+            </w:pPr>
+            <w:r>
+              <w:rPr>
+                <w:rFonts w:ascii="Calibri" w:hAnsi="Calibri"/>
+                <w:sz w:val="19"/>
+              </w:rPr>
+              <w:t>PD0</w:t>
+            </w:r>
+          </w:p>
+        </w:tc>
+        <w:tc>
+          <w:tcPr>
+            <w:tcW w:type="dxa" w:w="1584"/>
+            <w:vAlign w:val="center"/>
+            <w:shd w:fill="F2F4F7"/>
+          </w:tcPr>
+          <w:p>
+            <w:pPr>
+              <w:spacing w:after="0"/>
+            </w:pPr>
+            <w:r>
+              <w:rPr>
+                <w:rFonts w:ascii="Calibri" w:hAnsi="Calibri"/>
+                <w:sz w:val="19"/>
+              </w:rPr>
+            </w:r>
+          </w:p>
+        </w:tc>
+      </w:tr>
+      <w:tr>
+        <w:tc>
+          <w:tcPr>
+            <w:tcW w:type="dxa" w:w="1224"/>
+            <w:vAlign w:val="center"/>
+          </w:tcPr>
+          <w:p>
+            <w:pPr>
+              <w:spacing w:after="0"/>
+            </w:pPr>
+            <w:r>
+              <w:rPr>
+                <w:rFonts w:ascii="Calibri" w:hAnsi="Calibri"/>
+                <w:sz w:val="19"/>
+              </w:rPr>
+              <w:t>5</w:t>
+            </w:r>
+          </w:p>
+        </w:tc>
+        <w:tc>
+          <w:tcPr>
+            <w:tcW w:type="dxa" w:w="2304"/>
+            <w:vAlign w:val="center"/>
+          </w:tcPr>
+          <w:p>
+            <w:pPr>
+              <w:spacing w:after="0"/>
+            </w:pPr>
+            <w:r>
+              <w:rPr>
+                <w:rFonts w:ascii="Calibri" w:hAnsi="Calibri"/>
+                <w:sz w:val="19"/>
+              </w:rPr>
+              <w:t>00000101</w:t>
+            </w:r>
+          </w:p>
+        </w:tc>
+        <w:tc>
+          <w:tcPr>
+            <w:tcW w:type="dxa" w:w="4248"/>
+            <w:vAlign w:val="center"/>
+          </w:tcPr>
+          <w:p>
+            <w:pPr>
+              <w:spacing w:after="0"/>
+            </w:pPr>
+            <w:r>
+              <w:rPr>
+                <w:rFonts w:ascii="Calibri" w:hAnsi="Calibri"/>
+                <w:sz w:val="19"/>
+              </w:rPr>
+              <w:t>PD2 y PD0</w:t>
+            </w:r>
+          </w:p>
+        </w:tc>
+        <w:tc>
+          <w:tcPr>
+            <w:tcW w:type="dxa" w:w="1584"/>
+            <w:vAlign w:val="center"/>
+          </w:tcPr>
+          <w:p>
+            <w:pPr>
+              <w:spacing w:after="0"/>
+            </w:pPr>
+            <w:r>
+              <w:rPr>
+                <w:rFonts w:ascii="Calibri" w:hAnsi="Calibri"/>
+                <w:sz w:val="19"/>
+              </w:rPr>
+            </w:r>
+          </w:p>
+        </w:tc>
+      </w:tr>
+      <w:tr>
+        <w:tc>
+          <w:tcPr>
+            <w:tcW w:type="dxa" w:w="1224"/>
+            <w:vAlign w:val="center"/>
+            <w:shd w:fill="F2F4F7"/>
+          </w:tcPr>
+          <w:p>
+            <w:pPr>
+              <w:spacing w:after="0"/>
+            </w:pPr>
+            <w:r>
+              <w:rPr>
+                <w:rFonts w:ascii="Calibri" w:hAnsi="Calibri"/>
+                <w:sz w:val="19"/>
+              </w:rPr>
+              <w:t>15</w:t>
+            </w:r>
+          </w:p>
+        </w:tc>
+        <w:tc>
+          <w:tcPr>
+            <w:tcW w:type="dxa" w:w="2304"/>
+            <w:vAlign w:val="center"/>
+            <w:shd w:fill="F2F4F7"/>
+          </w:tcPr>
+          <w:p>
+            <w:pPr>
+              <w:spacing w:after="0"/>
+            </w:pPr>
+            <w:r>
+              <w:rPr>
+                <w:rFonts w:ascii="Calibri" w:hAnsi="Calibri"/>
+                <w:sz w:val="19"/>
+              </w:rPr>
+              <w:t>00001111</w:t>
+            </w:r>
+          </w:p>
+        </w:tc>
+        <w:tc>
+          <w:tcPr>
+            <w:tcW w:type="dxa" w:w="4248"/>
+            <w:vAlign w:val="center"/>
+            <w:shd w:fill="F2F4F7"/>
+          </w:tcPr>
+          <w:p>
+            <w:pPr>
+              <w:spacing w:after="0"/>
+            </w:pPr>
+            <w:r>
+              <w:rPr>
+                <w:rFonts w:ascii="Calibri" w:hAnsi="Calibri"/>
+                <w:sz w:val="19"/>
+              </w:rPr>
+              <w:t>PD3 a PD0</w:t>
+            </w:r>
+          </w:p>
+        </w:tc>
+        <w:tc>
+          <w:tcPr>
+            <w:tcW w:type="dxa" w:w="1584"/>
+            <w:vAlign w:val="center"/>
+            <w:shd w:fill="F2F4F7"/>
+          </w:tcPr>
+          <w:p>
+            <w:pPr>
+              <w:spacing w:after="0"/>
+            </w:pPr>
+            <w:r>
+              <w:rPr>
+                <w:rFonts w:ascii="Calibri" w:hAnsi="Calibri"/>
+                <w:sz w:val="19"/>
+              </w:rPr>
+            </w:r>
+          </w:p>
+        </w:tc>
+      </w:tr>
+      <w:tr>
+        <w:tc>
+          <w:tcPr>
+            <w:tcW w:type="dxa" w:w="1224"/>
+            <w:vAlign w:val="center"/>
+          </w:tcPr>
+          <w:p>
+            <w:pPr>
+              <w:spacing w:after="0"/>
+            </w:pPr>
+            <w:r>
+              <w:rPr>
+                <w:rFonts w:ascii="Calibri" w:hAnsi="Calibri"/>
+                <w:sz w:val="19"/>
+              </w:rPr>
+              <w:t>170</w:t>
+            </w:r>
+          </w:p>
+        </w:tc>
+        <w:tc>
+          <w:tcPr>
+            <w:tcW w:type="dxa" w:w="2304"/>
+            <w:vAlign w:val="center"/>
+          </w:tcPr>
+          <w:p>
+            <w:pPr>
+              <w:spacing w:after="0"/>
+            </w:pPr>
+            <w:r>
+              <w:rPr>
+                <w:rFonts w:ascii="Calibri" w:hAnsi="Calibri"/>
+                <w:sz w:val="19"/>
+              </w:rPr>
+              <w:t>10101010</w:t>
+            </w:r>
+          </w:p>
+        </w:tc>
+        <w:tc>
+          <w:tcPr>
+            <w:tcW w:type="dxa" w:w="4248"/>
+            <w:vAlign w:val="center"/>
+          </w:tcPr>
+          <w:p>
+            <w:pPr>
+              <w:spacing w:after="0"/>
+            </w:pPr>
+            <w:r>
+              <w:rPr>
+                <w:rFonts w:ascii="Calibri" w:hAnsi="Calibri"/>
+                <w:sz w:val="19"/>
+              </w:rPr>
+              <w:t>PD7, PD5, PD3 y PD1</w:t>
+            </w:r>
+          </w:p>
+        </w:tc>
+        <w:tc>
+          <w:tcPr>
+            <w:tcW w:type="dxa" w:w="1584"/>
+            <w:vAlign w:val="center"/>
+          </w:tcPr>
+          <w:p>
+            <w:pPr>
+              <w:spacing w:after="0"/>
+            </w:pPr>
+            <w:r>
+              <w:rPr>
+                <w:rFonts w:ascii="Calibri" w:hAnsi="Calibri"/>
+                <w:sz w:val="19"/>
+              </w:rPr>
+            </w:r>
+          </w:p>
+        </w:tc>
+      </w:tr>
+      <w:tr>
+        <w:tc>
+          <w:tcPr>
+            <w:tcW w:type="dxa" w:w="1224"/>
+            <w:vAlign w:val="center"/>
+            <w:shd w:fill="F2F4F7"/>
+          </w:tcPr>
+          <w:p>
+            <w:pPr>
+              <w:spacing w:after="0"/>
+            </w:pPr>
+            <w:r>
+              <w:rPr>
+                <w:rFonts w:ascii="Calibri" w:hAnsi="Calibri"/>
+                <w:sz w:val="19"/>
+              </w:rPr>
+              <w:t>255</w:t>
+            </w:r>
+          </w:p>
+        </w:tc>
+        <w:tc>
+          <w:tcPr>
+            <w:tcW w:type="dxa" w:w="2304"/>
+            <w:vAlign w:val="center"/>
+            <w:shd w:fill="F2F4F7"/>
+          </w:tcPr>
+          <w:p>
+            <w:pPr>
+              <w:spacing w:after="0"/>
+            </w:pPr>
+            <w:r>
+              <w:rPr>
+                <w:rFonts w:ascii="Calibri" w:hAnsi="Calibri"/>
+                <w:sz w:val="19"/>
+              </w:rPr>
+              <w:t>11111111</w:t>
+            </w:r>
+          </w:p>
+        </w:tc>
+        <w:tc>
+          <w:tcPr>
+            <w:tcW w:type="dxa" w:w="4248"/>
+            <w:vAlign w:val="center"/>
+            <w:shd w:fill="F2F4F7"/>
+          </w:tcPr>
+          <w:p>
+            <w:pPr>
+              <w:spacing w:after="0"/>
+            </w:pPr>
+            <w:r>
+              <w:rPr>
+                <w:rFonts w:ascii="Calibri" w:hAnsi="Calibri"/>
+                <w:sz w:val="19"/>
+              </w:rPr>
+              <w:t>Todos</w:t>
+            </w:r>
+          </w:p>
+        </w:tc>
+        <w:tc>
+          <w:tcPr>
+            <w:tcW w:type="dxa" w:w="1584"/>
+            <w:vAlign w:val="center"/>
+            <w:shd w:fill="F2F4F7"/>
+          </w:tcPr>
+          <w:p>
+            <w:pPr>
+              <w:spacing w:after="0"/>
+            </w:pPr>
+            <w:r>
+              <w:rPr>
+                <w:rFonts w:ascii="Calibri" w:hAnsi="Calibri"/>
+                <w:sz w:val="19"/>
+              </w:rPr>
+            </w:r>
+          </w:p>
+        </w:tc>
+      </w:tr>
+    </w:tbl>
+    <w:p>
+      <w:pPr>
+        <w:pStyle w:val="Heading2"/>
+      </w:pPr>
+      <w:r>
+        <w:t>Preguntas para defender el trabajo</w:t>
+      </w:r>
+    </w:p>
+    <w:p>
+      <w:pPr>
+        <w:pStyle w:val="ListBullet"/>
+      </w:pPr>
+      <w:r>
+        <w:t>¿Por qué patron_led se declara como uint8_t?</w:t>
+      </w:r>
+    </w:p>
+    <w:p>
+      <w:pPr>
+        <w:pStyle w:val="ListBullet"/>
+      </w:pPr>
+      <w:r>
+        <w:t>¿Qué ocurriría visualmente si se asigna 256 a una variable uint8_t?</w:t>
+      </w:r>
+    </w:p>
+    <w:p>
+      <w:pPr>
+        <w:pStyle w:val="ListBullet"/>
+      </w:pPr>
+      <w:r>
+        <w:t>¿Por qué cada LED necesita su propia resistencia?</w:t>
+      </w:r>
+    </w:p>
+    <w:p>
+      <w:pPr>
+        <w:pStyle w:val="ListBullet"/>
+      </w:pPr>
+      <w:r>
+        <w:t>¿Qué función tienen VCC, AVCC y los dos pines GND?</w:t>
+      </w:r>
+    </w:p>
+    <w:p>
+      <w:pPr>
+        <w:pStyle w:val="ListBullet"/>
+      </w:pPr>
+      <w:r>
+        <w:t>¿Por qué el montaje no debe alimentarse antes de que se revise la polaridad y las conexiones?</w:t>
+      </w:r>
+    </w:p>
+    <w:p>
+      <w:pPr>
+        <w:pStyle w:val="Heading2"/>
+      </w:pPr>
+      <w:r>
+        <w:t>Criterios de evaluación</w:t>
+      </w:r>
+    </w:p>
+    <w:tbl>
+      <w:tblPr>
+        <w:tblStyle w:val="TableGrid"/>
+        <w:tblW w:type="auto" w:w="0"/>
+        <w:jc w:val="center"/>
+        <w:tblLayout w:type="fixed"/>
+        <w:tblLook w:firstColumn="1" w:firstRow="1" w:lastColumn="0" w:lastRow="0" w:noHBand="0" w:noVBand="1" w:val="04A0"/>
+      </w:tblPr>
+      <w:tblGrid>
+        <w:gridCol w:w="4896"/>
+        <w:gridCol w:w="4896"/>
+      </w:tblGrid>
+      <w:tr>
+        <w:tc>
+          <w:tcPr>
+            <w:tcW w:type="dxa" w:w="8208"/>
+            <w:vAlign w:val="center"/>
+            <w:shd w:fill="2E74B5"/>
+          </w:tcPr>
+          <w:p>
+            <w:pPr>
+              <w:spacing w:after="0"/>
+            </w:pPr>
+            <w:r>
+              <w:rPr>
+                <w:rFonts w:ascii="Calibri" w:hAnsi="Calibri"/>
+                <w:b/>
+                <w:color w:val="FFFFFF"/>
+                <w:sz w:val="19"/>
+              </w:rPr>
+              <w:t>Criterio</w:t>
+            </w:r>
+          </w:p>
+        </w:tc>
+        <w:tc>
+          <w:tcPr>
+            <w:tcW w:type="dxa" w:w="1152"/>
+            <w:vAlign w:val="center"/>
+            <w:shd w:fill="2E74B5"/>
+          </w:tcPr>
+          <w:p>
+            <w:pPr>
+              <w:spacing w:after="0"/>
+            </w:pPr>
+            <w:r>
+              <w:rPr>
+                <w:rFonts w:ascii="Calibri" w:hAnsi="Calibri"/>
+                <w:b/>
+                <w:color w:val="FFFFFF"/>
+                <w:sz w:val="19"/>
+              </w:rPr>
+              <w:t>Puntos</w:t>
+            </w:r>
+          </w:p>
+        </w:tc>
+      </w:tr>
+      <w:tr>
+        <w:tc>
+          <w:tcPr>
+            <w:tcW w:type="dxa" w:w="8208"/>
+            <w:vAlign w:val="center"/>
+            <w:shd w:fill="F2F4F7"/>
+          </w:tcPr>
+          <w:p>
+            <w:pPr>
+              <w:spacing w:after="0"/>
+            </w:pPr>
+            <w:r>
+              <w:rPr>
+                <w:rFonts w:ascii="Calibri" w:hAnsi="Calibri"/>
+                <w:sz w:val="19"/>
+              </w:rPr>
+              <w:t>Materiales completos y montaje ordenado, sin alimentar antes de revisar.</w:t>
+            </w:r>
+          </w:p>
+        </w:tc>
+        <w:tc>
+          <w:tcPr>
+            <w:tcW w:type="dxa" w:w="1152"/>
+            <w:vAlign w:val="center"/>
+            <w:shd w:fill="F2F4F7"/>
+          </w:tcPr>
+          <w:p>
+            <w:pPr>
+              <w:spacing w:after="0"/>
+            </w:pPr>
+            <w:r>
+              <w:rPr>
+                <w:rFonts w:ascii="Calibri" w:hAnsi="Calibri"/>
+                <w:sz w:val="19"/>
+              </w:rPr>
+              <w:t>2</w:t>
+            </w:r>
+          </w:p>
+        </w:tc>
+      </w:tr>
+      <w:tr>
+        <w:tc>
+          <w:tcPr>
+            <w:tcW w:type="dxa" w:w="8208"/>
+            <w:vAlign w:val="center"/>
+          </w:tcPr>
+          <w:p>
+            <w:pPr>
+              <w:spacing w:after="0"/>
+            </w:pPr>
+            <w:r>
+              <w:rPr>
+                <w:rFonts w:ascii="Calibri" w:hAnsi="Calibri"/>
+                <w:sz w:val="19"/>
+              </w:rPr>
+              <w:t>Alimentación, RESET y conexiones de LEDs correctas.</w:t>
+            </w:r>
+          </w:p>
+        </w:tc>
+        <w:tc>
+          <w:tcPr>
+            <w:tcW w:type="dxa" w:w="1152"/>
+            <w:vAlign w:val="center"/>
+          </w:tcPr>
+          <w:p>
+            <w:pPr>
+              <w:spacing w:after="0"/>
+            </w:pPr>
+            <w:r>
+              <w:rPr>
+                <w:rFonts w:ascii="Calibri" w:hAnsi="Calibri"/>
+                <w:sz w:val="19"/>
+              </w:rPr>
+              <w:t>3</w:t>
+            </w:r>
+          </w:p>
+        </w:tc>
+      </w:tr>
+      <w:tr>
+        <w:tc>
+          <w:tcPr>
+            <w:tcW w:type="dxa" w:w="8208"/>
+            <w:vAlign w:val="center"/>
+            <w:shd w:fill="F2F4F7"/>
+          </w:tcPr>
+          <w:p>
+            <w:pPr>
+              <w:spacing w:after="0"/>
+            </w:pPr>
+            <w:r>
+              <w:rPr>
+                <w:rFonts w:ascii="Calibri" w:hAnsi="Calibri"/>
+                <w:sz w:val="19"/>
+              </w:rPr>
+              <w:t>Código compila y el archivo .hex se programa correctamente.</w:t>
+            </w:r>
+          </w:p>
+        </w:tc>
+        <w:tc>
+          <w:tcPr>
+            <w:tcW w:type="dxa" w:w="1152"/>
+            <w:vAlign w:val="center"/>
+            <w:shd w:fill="F2F4F7"/>
+          </w:tcPr>
+          <w:p>
+            <w:pPr>
+              <w:spacing w:after="0"/>
+            </w:pPr>
+            <w:r>
+              <w:rPr>
+                <w:rFonts w:ascii="Calibri" w:hAnsi="Calibri"/>
+                <w:sz w:val="19"/>
+              </w:rPr>
+              <w:t>2</w:t>
+            </w:r>
+          </w:p>
+        </w:tc>
+      </w:tr>
+      <w:tr>
+        <w:tc>
+          <w:tcPr>
+            <w:tcW w:type="dxa" w:w="8208"/>
+            <w:vAlign w:val="center"/>
+          </w:tcPr>
+          <w:p>
+            <w:pPr>
+              <w:spacing w:after="0"/>
+            </w:pPr>
+            <w:r>
+              <w:rPr>
+                <w:rFonts w:ascii="Calibri" w:hAnsi="Calibri"/>
+                <w:sz w:val="19"/>
+              </w:rPr>
+              <w:t>Tabla de cinco pruebas y explicación del patrón binario.</w:t>
+            </w:r>
+          </w:p>
+        </w:tc>
+        <w:tc>
+          <w:tcPr>
+            <w:tcW w:type="dxa" w:w="1152"/>
+            <w:vAlign w:val="center"/>
+          </w:tcPr>
+          <w:p>
+            <w:pPr>
+              <w:spacing w:after="0"/>
+            </w:pPr>
+            <w:r>
+              <w:rPr>
+                <w:rFonts w:ascii="Calibri" w:hAnsi="Calibri"/>
+                <w:sz w:val="19"/>
+              </w:rPr>
+              <w:t>2</w:t>
+            </w:r>
+          </w:p>
+        </w:tc>
+      </w:tr>
+      <w:tr>
+        <w:tc>
+          <w:tcPr>
+            <w:tcW w:type="dxa" w:w="8208"/>
+            <w:vAlign w:val="center"/>
+            <w:shd w:fill="F2F4F7"/>
+          </w:tcPr>
+          <w:p>
+            <w:pPr>
+              <w:spacing w:after="0"/>
+            </w:pPr>
+            <w:r>
+              <w:rPr>
+                <w:rFonts w:ascii="Calibri" w:hAnsi="Calibri"/>
+                <w:sz w:val="19"/>
+              </w:rPr>
+              <w:t>Uso correcto de uint8_t y explicación de la elección.</w:t>
+            </w:r>
+          </w:p>
+        </w:tc>
+        <w:tc>
+          <w:tcPr>
+            <w:tcW w:type="dxa" w:w="1152"/>
+            <w:vAlign w:val="center"/>
+            <w:shd w:fill="F2F4F7"/>
+          </w:tcPr>
+          <w:p>
+            <w:pPr>
+              <w:spacing w:after="0"/>
+            </w:pPr>
+            <w:r>
+              <w:rPr>
+                <w:rFonts w:ascii="Calibri" w:hAnsi="Calibri"/>
+                <w:sz w:val="19"/>
+              </w:rPr>
+              <w:t>1</w:t>
+            </w:r>
+          </w:p>
+        </w:tc>
+      </w:tr>
+    </w:tbl>
     <w:sectPr>
       <w:headerReference w:type="default" r:id="rId9"/>
       <w:footerReference w:type="default" r:id="rId10"/>

</xml_diff>